<commit_message>
Split the positioning into two full-stack tracks, Laravel and JS
The two are different jobs and were reading as one. Laravel with React is
production work; NestJS with React is a track I am learning now, so it is
labelled that way everywhere rather than folded in with shipped skills.

Site: backend and frontend skill groups renamed to name their stack, plus
a "Full-stack JS - in progress" group. Hero and about say plainly that
one track ships today and the other is being built out. Both languages.

CV: engineer variant gains a matching in-progress row that makes the
transfer argument - the layered architecture, DTO boundaries and RBAC
already exist in Laravel, only the runtime is new - and the summary names
both tracks. Still two pages in all four documents.

Co-Authored-By: Claude Opus 5 <noreply@anthropic.com>
Claude-Session: https://claude.ai/code/session_01EVzti1gXPmjmNDkdVPuFG9
</commit_message>
<xml_diff>
--- a/assets/files/Mohamad-Hasan-CV-FullStack-AR.docx
+++ b/assets/files/Mohamad-Hasan-CV-FullStack-AR.docx
@@ -98,7 +98,7 @@
           <w:color w:val="4A5568"/>
           <w:sz w:val="18"/>
         </w:rPr>
-        <w:t>مطوّر Full-Stack بستّ سنوات في بناء برمجيات تجارية تعتمد عليها شركات فعلية يومياً. Laravel و PHP 8 في الخلفية — طبقات خدمات مبنية على حدود النطاق، وواجهات REST مُصدَّرة بإصدارات، وتفويض عبر Policies، وطوابير وتخزين مؤقّت — مع React و Next.js و TypeScript في الواجهة. أخذتُ أربع منصّات وخمسة تطبيقات موبايل من أول متطلَّب حتى دعم الإنتاج، منها سوق متعدّد البائعين ومنصّة ترخيص وفوترة مبنية كمونوليث معياري من 14 وحدة. مهندس نظم حاسوبية بمرتبة الشرف، وأبني بالعربية أولاً (RTL) افتراضياً.</w:t>
+        <w:t>مطوّر Full-Stack بستّ سنوات في بناء برمجيات تجارية تعتمد عليها شركات فعلية يومياً. Laravel و PHP 8 في الخلفية — طبقات خدمات مبنية على حدود النطاق، وواجهات REST مُصدَّرة بإصدارات، وتفويض عبر Policies، وطوابير وتخزين مؤقّت — مع React و Next.js و TypeScript في الواجهة. أخذتُ أربع منصّات وخمسة تطبيقات موبايل من أول متطلَّب حتى دعم الإنتاج، منها سوق متعدّد البائعين ومنصّة ترخيص وفوترة مبنية كمونوليث معياري من 14 وحدة. أعمل ضمن مساري Full-Stack: مسار Laravel مع React وهو قيد الإنتاج اليوم، ومسار TypeScript الكامل مع NestJS وأبنيه حالياً على نفس البنية. مهندس نظم حاسوبية بمرتبة الشرف، وأبني بالعربية أولاً (RTL) افتراضياً.</w:t>
       </w:r>
     </w:p>
     <w:p>
@@ -133,7 +133,7 @@
           <w:color w:val="0F1720"/>
           <w:sz w:val="18"/>
         </w:rPr>
-        <w:t xml:space="preserve">الخلفية (Backend): </w:t>
+        <w:t xml:space="preserve">الخلفية — Laravel: </w:t>
       </w:r>
       <w:r>
         <w:rPr>
@@ -158,7 +158,7 @@
           <w:color w:val="0F1720"/>
           <w:sz w:val="18"/>
         </w:rPr>
-        <w:t xml:space="preserve">الواجهة (Frontend): </w:t>
+        <w:t xml:space="preserve">الواجهة — React و TypeScript: </w:t>
       </w:r>
       <w:r>
         <w:rPr>
@@ -168,6 +168,31 @@
           <w:sz w:val="18"/>
         </w:rPr>
         <w:t>TypeScript، React 18/19، Next.js 16، TanStack Query، Tailwind v4، shadcn/ui، next-intl (RTL)، Blade، JavaScript، HTML5، CSS3</w:t>
+      </w:r>
+    </w:p>
+    <w:p>
+      <w:pPr>
+        <w:spacing w:before="0" w:after="40" w:line="269" w:lineRule="auto"/>
+        <w:bidi/>
+        <w:jc w:val="right"/>
+      </w:pPr>
+      <w:r>
+        <w:rPr>
+          <w:rFonts w:ascii="Segoe UI" w:hAnsi="Segoe UI" w:cs="Segoe UI"/>
+          <w:b/>
+          <w:color w:val="0F1720"/>
+          <w:sz w:val="18"/>
+        </w:rPr>
+        <w:t xml:space="preserve">Full-Stack JS (قيد التعلّم): </w:t>
+      </w:r>
+      <w:r>
+        <w:rPr>
+          <w:rFonts w:ascii="Segoe UI" w:hAnsi="Segoe UI" w:cs="Segoe UI"/>
+          <w:b w:val="0"/>
+          <w:color w:val="4A5568"/>
+          <w:sz w:val="18"/>
+        </w:rPr>
+        <w:t>NestJS، Node.js، Modules و Dependency Injection، DTOs و Validation Pipes، Guards و Interceptors، TypeORM / Prisma، Jest — نفس البنية الطبقية وحدود DTO والصلاحيات حسب الدور التي أعمل بها في Laravel، منقولة إلى بيئة Node. واجهة React و TypeScript موجودة فعلياً في الإنتاج.</w:t>
       </w:r>
     </w:p>
     <w:p>

</xml_diff>